<commit_message>
Audit corrections: fix script 12 join bug, disclose rim-delineation limitation, correct compactness/legal/NSM claims, rebuild maps 01/04 and Figures 5/10 in Python
</commit_message>
<xml_diff>
--- a/Highlights.docx
+++ b/Highlights.docx
@@ -27,7 +27,7 @@
       </w:pPr>
       <w:r>
         <w:rPr/>
-        <w:t>190.3 ha of karewa terrace converted to bare earth since 1994, mostly since 2015.</w:t>
+        <w:t>Net 190.3 ha bare-earth increase on karewa terraces since 1994, mostly post-2015.</w:t>
       </w:r>
     </w:p>
     <w:p>
@@ -69,7 +69,7 @@
       </w:pPr>
       <w:r>
         <w:rPr/>
-        <w:t>No current law protects karewa land in J&amp;K from excavation.</w:t>
+        <w:t>No karewa-specific law in J&amp;K currently protects karewas from excavation.</w:t>
       </w:r>
     </w:p>
     <w:p>

</xml_diff>